<commit_message>
Replace folder 6 with technical evaluation report and autofill S1 details
</commit_message>
<xml_diff>
--- a/templates/ende/06.docx
+++ b/templates/ende/06.docx
@@ -3,99 +3,190 @@
 <w:document xmlns:wpc="http://schemas.microsoft.com/office/word/2010/wordprocessingCanvas" xmlns:mo="http://schemas.microsoft.com/office/mac/office/2008/main" xmlns:mc="http://schemas.openxmlformats.org/markup-compatibility/2006" xmlns:mv="urn:schemas-microsoft-com:mac:vml" xmlns:o="urn:schemas-microsoft-com:office:office" xmlns:r="http://schemas.openxmlformats.org/officeDocument/2006/relationships" xmlns:m="http://schemas.openxmlformats.org/officeDocument/2006/math" xmlns:v="urn:schemas-microsoft-com:vml" xmlns:wp14="http://schemas.microsoft.com/office/word/2010/wordprocessingDrawing" xmlns:wp="http://schemas.openxmlformats.org/drawingml/2006/wordprocessingDrawing" xmlns:w10="urn:schemas-microsoft-com:office:word" xmlns:w="http://schemas.openxmlformats.org/wordprocessingml/2006/main" xmlns:w14="http://schemas.microsoft.com/office/word/2010/wordml" xmlns:wpg="http://schemas.microsoft.com/office/word/2010/wordprocessingGroup" xmlns:wpi="http://schemas.microsoft.com/office/word/2010/wordprocessingInk" xmlns:wne="http://schemas.microsoft.com/office/word/2006/wordml" xmlns:wps="http://schemas.microsoft.com/office/word/2010/wordprocessingShape" mc:Ignorable="w14 wp14">
   <w:body>
     <w:p>
-      <w:r>
-        <w:drawing>
-          <wp:inline xmlns:a="http://schemas.openxmlformats.org/drawingml/2006/main" xmlns:pic="http://schemas.openxmlformats.org/drawingml/2006/picture">
-            <wp:extent cx="1080000" cy="570000"/>
-            <wp:docPr id="1" name="Picture 1"/>
-            <wp:cNvGraphicFramePr>
-              <a:graphicFrameLocks noChangeAspect="1"/>
-            </wp:cNvGraphicFramePr>
-            <a:graphic>
-              <a:graphicData uri="http://schemas.openxmlformats.org/drawingml/2006/picture">
-                <pic:pic>
-                  <pic:nvPicPr>
-                    <pic:cNvPr id="0" name="logo-ende-deoruro.png"/>
-                    <pic:cNvPicPr/>
-                  </pic:nvPicPr>
-                  <pic:blipFill>
-                    <a:blip r:embed="rId9"/>
-                    <a:stretch>
-                      <a:fillRect/>
-                    </a:stretch>
-                  </pic:blipFill>
-                  <pic:spPr>
-                    <a:xfrm>
-                      <a:off x="0" y="0"/>
-                      <a:ext cx="1080000" cy="570000"/>
-                    </a:xfrm>
-                    <a:prstGeom prst="rect"/>
-                  </pic:spPr>
-                </pic:pic>
-              </a:graphicData>
-            </a:graphic>
-          </wp:inline>
-        </w:drawing>
-      </w:r>
-    </w:p>
-    <w:p>
       <w:pPr>
+        <w:keepNext/>
         <w:jc w:val="center"/>
       </w:pPr>
       <w:r>
         <w:rPr>
           <w:b/>
+          <w:sz w:val="24"/>
         </w:rPr>
-        <w:t>DISTRIBUIDORA DE ELECTRICIDAD ENDE DEORURO S.A.</w:t>
+        <w:t>INFORME TÉCNICO DE EVALUACIÓN</w:t>
+        <w:br/>
+        <w:t>DE OFERTAS Y CUADRO COMPARATIVO</w:t>
+      </w:r>
+    </w:p>
+    <w:tbl>
+      <w:tblPr>
+        <w:tblW w:type="auto" w:w="0"/>
+        <w:tblLook w:firstColumn="1" w:firstRow="1" w:lastColumn="0" w:lastRow="0" w:noHBand="0" w:noVBand="1" w:val="04A0"/>
+      </w:tblPr>
+      <w:tblGrid>
+        <w:gridCol w:w="4705"/>
+        <w:gridCol w:w="4705"/>
+      </w:tblGrid>
+      <w:tr>
+        <w:tc>
+          <w:tcPr>
+            <w:tcW w:type="dxa" w:w="4705"/>
+            <w:shd w:fill="EEEEEE"/>
+          </w:tcPr>
+          <w:p>
+            <w:r>
+              <w:rPr>
+                <w:b/>
+              </w:rPr>
+              <w:t>Oruro, {{fecha}}</w:t>
+            </w:r>
+          </w:p>
+        </w:tc>
+        <w:tc>
+          <w:tcPr>
+            <w:tcW w:type="dxa" w:w="4705"/>
+            <w:shd w:fill="EEEEEE"/>
+          </w:tcPr>
+          <w:p>
+            <w:pPr>
+              <w:jc w:val="right"/>
+            </w:pPr>
+            <w:r>
+              <w:rPr>
+                <w:b/>
+              </w:rPr>
+              <w:t>Informe N.º {{numero}}</w:t>
+            </w:r>
+          </w:p>
+        </w:tc>
+      </w:tr>
+    </w:tbl>
+    <w:p/>
+    <w:p>
+      <w:r>
+        <w:rPr>
+          <w:b/>
+        </w:rPr>
+        <w:t xml:space="preserve">A:  </w:t>
+      </w:r>
+      <w:r>
+        <w:t>{{destinatario}}</w:t>
+      </w:r>
+    </w:p>
+    <w:p>
+      <w:r>
+        <w:rPr>
+          <w:b/>
+        </w:rPr>
+        <w:t xml:space="preserve">VÍA:  </w:t>
+      </w:r>
+      <w:r>
+        <w:t>{{via}}</w:t>
+      </w:r>
+    </w:p>
+    <w:p>
+      <w:r>
+        <w:rPr>
+          <w:b/>
+        </w:rPr>
+        <w:t xml:space="preserve">DE:  </w:t>
+      </w:r>
+      <w:r>
+        <w:t>{{solicitante}}</w:t>
+      </w:r>
+    </w:p>
+    <w:p>
+      <w:r>
+        <w:rPr>
+          <w:b/>
+        </w:rPr>
+        <w:t xml:space="preserve">PROCESO:  </w:t>
+      </w:r>
+      <w:r>
+        <w:t>{{objeto}}</w:t>
+      </w:r>
+    </w:p>
+    <w:p>
+      <w:r>
+        <w:rPr>
+          <w:b/>
+        </w:rPr>
+        <w:t xml:space="preserve">SOLICITUD:  </w:t>
+      </w:r>
+      <w:r>
+        <w:t>{{solicitud}}</w:t>
       </w:r>
     </w:p>
     <w:p>
       <w:pPr>
-        <w:jc w:val="center"/>
+        <w:pBdr>
+          <w:bottom w:val="single" w:sz="12" w:color="000000"/>
+        </w:pBdr>
+      </w:pPr>
+    </w:p>
+    <w:p>
+      <w:pPr>
+        <w:keepNext/>
+        <w:spacing w:before="200"/>
       </w:pPr>
       <w:r>
         <w:rPr>
           <w:b/>
         </w:rPr>
-        <w:t>SOLICITUD DE COTIZACIÓN</w:t>
+        <w:t>1. ANTECEDENTES</w:t>
+      </w:r>
+    </w:p>
+    <w:p>
+      <w:r>
+        <w:t>{{antecedentes}}</w:t>
       </w:r>
     </w:p>
     <w:p>
       <w:pPr>
-        <w:jc w:val="center"/>
+        <w:keepNext/>
+        <w:spacing w:before="200"/>
       </w:pPr>
       <w:r>
-        <w:t>FORMULARIO S2-N014</w:t>
+        <w:rPr>
+          <w:b/>
+        </w:rPr>
+        <w:t>2. RECEPCIÓN DE COTIZACIONES</w:t>
       </w:r>
     </w:p>
     <w:p>
       <w:r>
-        <w:t>Fecha de solicitud: {{fecha}}</w:t>
+        <w:t>{{recepcion}}</w:t>
+      </w:r>
+    </w:p>
+    <w:p>
+      <w:pPr>
+        <w:keepNext/>
+        <w:spacing w:before="200"/>
+      </w:pPr>
+      <w:r>
+        <w:rPr>
+          <w:b/>
+        </w:rPr>
+        <w:t>3. EVALUACIÓN TÉCNICA Y ECONÓMICA</w:t>
       </w:r>
     </w:p>
     <w:p>
       <w:r>
-        <w:t>Señor(es): {{destinatario}}</w:t>
-      </w:r>
-    </w:p>
-    <w:p>
-      <w:r>
-        <w:t>Por favor cotizar los siguientes bienes/obras/servicios:</w:t>
+        <w:t>{{evaluacion}}</w:t>
       </w:r>
     </w:p>
     <w:tbl>
       <w:tblPr>
         <w:tblStyle w:val="TableGrid"/>
         <w:tblW w:type="auto" w:w="0"/>
+        <w:tblLayout w:type="fixed"/>
         <w:tblLook w:firstColumn="1" w:firstRow="1" w:lastColumn="0" w:lastRow="0" w:noHBand="0" w:noVBand="1" w:val="04A0"/>
       </w:tblPr>
       <w:tblGrid>
-        <w:gridCol w:w="1644"/>
-        <w:gridCol w:w="1644"/>
-        <w:gridCol w:w="1644"/>
-        <w:gridCol w:w="1644"/>
-        <w:gridCol w:w="1644"/>
-        <w:gridCol w:w="1644"/>
+        <w:gridCol w:w="567"/>
+        <w:gridCol w:w="1474"/>
+        <w:gridCol w:w="2948"/>
+        <w:gridCol w:w="1191"/>
+        <w:gridCol w:w="3231"/>
       </w:tblGrid>
       <w:tr>
         <w:trPr>
@@ -103,61 +194,91 @@
         </w:trPr>
         <w:tc>
           <w:tcPr>
-            <w:tcW w:type="dxa" w:w="1644"/>
+            <w:tcW w:type="dxa" w:w="567"/>
+            <w:shd w:fill="F3F4E5"/>
           </w:tcPr>
           <w:p>
+            <w:pPr>
+              <w:spacing w:after="80"/>
+            </w:pPr>
             <w:r>
+              <w:rPr>
+                <w:b/>
+                <w:sz w:val="18"/>
+              </w:rPr>
               <w:t>N.º</w:t>
             </w:r>
           </w:p>
         </w:tc>
         <w:tc>
           <w:tcPr>
-            <w:tcW w:type="dxa" w:w="1644"/>
+            <w:tcW w:type="dxa" w:w="1474"/>
+            <w:shd w:fill="F3F4E5"/>
           </w:tcPr>
           <w:p>
+            <w:pPr>
+              <w:spacing w:after="80"/>
+            </w:pPr>
             <w:r>
-              <w:t>Cantidad</w:t>
+              <w:rPr>
+                <w:b/>
+                <w:sz w:val="18"/>
+              </w:rPr>
+              <w:t>Empresa</w:t>
             </w:r>
           </w:p>
         </w:tc>
         <w:tc>
           <w:tcPr>
-            <w:tcW w:type="dxa" w:w="1644"/>
+            <w:tcW w:type="dxa" w:w="2948"/>
+            <w:shd w:fill="F3F4E5"/>
           </w:tcPr>
           <w:p>
+            <w:pPr>
+              <w:spacing w:after="80"/>
+            </w:pPr>
             <w:r>
-              <w:t>Unidad</w:t>
+              <w:rPr>
+                <w:b/>
+                <w:sz w:val="18"/>
+              </w:rPr>
+              <w:t>Cotización / evaluación</w:t>
             </w:r>
           </w:p>
         </w:tc>
         <w:tc>
           <w:tcPr>
-            <w:tcW w:type="dxa" w:w="1644"/>
+            <w:tcW w:type="dxa" w:w="1191"/>
+            <w:shd w:fill="F3F4E5"/>
           </w:tcPr>
           <w:p>
+            <w:pPr>
+              <w:spacing w:after="80"/>
+            </w:pPr>
             <w:r>
-              <w:t>Descripción</w:t>
+              <w:rPr>
+                <w:b/>
+                <w:sz w:val="18"/>
+              </w:rPr>
+              <w:t>Precio (Bs)</w:t>
             </w:r>
           </w:p>
         </w:tc>
         <w:tc>
           <w:tcPr>
-            <w:tcW w:type="dxa" w:w="1644"/>
+            <w:tcW w:type="dxa" w:w="3231"/>
+            <w:shd w:fill="F3F4E5"/>
           </w:tcPr>
           <w:p>
+            <w:pPr>
+              <w:spacing w:after="80"/>
+            </w:pPr>
             <w:r>
-              <w:t>Precio unitario</w:t>
-            </w:r>
-          </w:p>
-        </w:tc>
-        <w:tc>
-          <w:tcPr>
-            <w:tcW w:type="dxa" w:w="1644"/>
-          </w:tcPr>
-          <w:p>
-            <w:r>
-              <w:t>Precio total</w:t>
+              <w:rPr>
+                <w:b/>
+                <w:sz w:val="18"/>
+              </w:rPr>
+              <w:t>Respaldo / actividad económica</w:t>
             </w:r>
           </w:p>
         </w:tc>
@@ -165,136 +286,230 @@
       <w:tr>
         <w:tc>
           <w:tcPr>
-            <w:tcW w:type="dxa" w:w="1644"/>
+            <w:tcW w:type="dxa" w:w="567"/>
           </w:tcPr>
           <w:p>
+            <w:pPr>
+              <w:spacing w:after="80"/>
+            </w:pPr>
             <w:r>
+              <w:rPr>
+                <w:sz w:val="18"/>
+              </w:rPr>
               <w:t>{{items.numero}}</w:t>
             </w:r>
           </w:p>
         </w:tc>
         <w:tc>
           <w:tcPr>
-            <w:tcW w:type="dxa" w:w="1644"/>
+            <w:tcW w:type="dxa" w:w="1474"/>
           </w:tcPr>
           <w:p>
+            <w:pPr>
+              <w:spacing w:after="80"/>
+            </w:pPr>
             <w:r>
-              <w:t>{{items.cantidad}}</w:t>
+              <w:rPr>
+                <w:sz w:val="18"/>
+              </w:rPr>
+              <w:t>{{items.empresa}}</w:t>
             </w:r>
           </w:p>
         </w:tc>
         <w:tc>
           <w:tcPr>
-            <w:tcW w:type="dxa" w:w="1644"/>
+            <w:tcW w:type="dxa" w:w="2948"/>
           </w:tcPr>
           <w:p>
+            <w:pPr>
+              <w:spacing w:after="80"/>
+            </w:pPr>
             <w:r>
-              <w:t>{{items.unidad}}</w:t>
+              <w:rPr>
+                <w:sz w:val="18"/>
+              </w:rPr>
+              <w:t>{{items.cotizacion}}</w:t>
             </w:r>
           </w:p>
         </w:tc>
         <w:tc>
           <w:tcPr>
-            <w:tcW w:type="dxa" w:w="1644"/>
+            <w:tcW w:type="dxa" w:w="1191"/>
           </w:tcPr>
           <w:p>
+            <w:pPr>
+              <w:spacing w:after="80"/>
+            </w:pPr>
             <w:r>
-              <w:t>{{items.descripcion}}</w:t>
+              <w:rPr>
+                <w:sz w:val="18"/>
+              </w:rPr>
+              <w:t>{{items.precio}}</w:t>
             </w:r>
           </w:p>
         </w:tc>
         <w:tc>
           <w:tcPr>
-            <w:tcW w:type="dxa" w:w="1644"/>
+            <w:tcW w:type="dxa" w:w="3231"/>
           </w:tcPr>
           <w:p>
+            <w:pPr>
+              <w:spacing w:after="80"/>
+            </w:pPr>
             <w:r>
-              <w:t>{{items.precio_oferta}}</w:t>
-            </w:r>
-          </w:p>
-        </w:tc>
-        <w:tc>
-          <w:tcPr>
-            <w:tcW w:type="dxa" w:w="1644"/>
-          </w:tcPr>
-          <w:p>
-            <w:r>
-              <w:t>{{items.total_oferta}}</w:t>
+              <w:rPr>
+                <w:sz w:val="18"/>
+              </w:rPr>
+              <w:t>{{items.respaldo}}</w:t>
             </w:r>
           </w:p>
         </w:tc>
       </w:tr>
     </w:tbl>
     <w:p>
+      <w:pPr>
+        <w:keepNext/>
+        <w:spacing w:before="200"/>
+      </w:pPr>
       <w:r>
-        <w:t>TOTAL (Bs): ________________________</w:t>
+        <w:rPr>
+          <w:b/>
+        </w:rPr>
+        <w:t>4. CONCLUSIONES</w:t>
       </w:r>
     </w:p>
     <w:p>
       <w:r>
-        <w:t>Tiempo de entrega: ________________________</w:t>
+        <w:t>{{conclusiones}}</w:t>
+      </w:r>
+    </w:p>
+    <w:p>
+      <w:pPr>
+        <w:keepNext/>
+        <w:spacing w:before="200"/>
+      </w:pPr>
+      <w:r>
+        <w:rPr>
+          <w:b/>
+        </w:rPr>
+        <w:t>5. RECOMENDACIONES</w:t>
       </w:r>
     </w:p>
     <w:p>
       <w:r>
-        <w:t>Validez de la oferta: ________________________</w:t>
+        <w:t>{{recomendaciones}}</w:t>
       </w:r>
     </w:p>
     <w:p>
       <w:r>
-        <w:t>OBSERVACIONES: {{observaciones}}</w:t>
+        <w:t>Es cuanto se informa para los fines consiguientes.</w:t>
+      </w:r>
+    </w:p>
+    <w:p/>
+    <w:p>
+      <w:pPr>
+        <w:keepNext/>
+        <w:keepLines/>
+        <w:spacing w:after="60"/>
+      </w:pPr>
+      <w:r>
+        <w:t>____________________________</w:t>
       </w:r>
     </w:p>
     <w:p>
+      <w:pPr>
+        <w:keepNext/>
+        <w:keepLines/>
+        <w:spacing w:after="60"/>
+      </w:pPr>
       <w:r>
-        <w:t>ADJUNTAR FOTOCOPIA SIMPLE DE SU RNC - NIT</w:t>
-      </w:r>
-    </w:p>
-    <w:p/>
-    <w:tbl>
-      <w:tblPr>
-        <w:tblW w:type="auto" w:w="0"/>
-        <w:tblLook w:firstColumn="1" w:firstRow="1" w:lastColumn="0" w:lastRow="0" w:noHBand="0" w:noVBand="1" w:val="04A0"/>
-      </w:tblPr>
-      <w:tblGrid>
-        <w:gridCol w:w="9866"/>
-      </w:tblGrid>
-      <w:tr>
-        <w:tc>
-          <w:tcPr>
-            <w:tcW w:type="dxa" w:w="9866"/>
-          </w:tcPr>
-          <w:p>
-            <w:r>
-              <w:br/>
-              <w:t>________________________</w:t>
-              <w:br/>
-              <w:t>Sello y firma del proveedor</w:t>
-              <w:br/>
-              <w:t>Firma y sello</w:t>
-            </w:r>
-          </w:p>
-        </w:tc>
-      </w:tr>
-    </w:tbl>
-    <w:p>
-      <w:r>
-        <w:t>Fecha de cotización: ________________________</w:t>
+        <w:t>{{solicitante}}</w:t>
       </w:r>
     </w:p>
     <w:p>
+      <w:pPr>
+        <w:keepNext w:val="0"/>
+        <w:keepLines/>
+        <w:spacing w:after="60"/>
+      </w:pPr>
       <w:r>
-        <w:t>NOTA: El presente registro no compromete una acción de compra de parte de ENDE DEORURO S.A.</w:t>
+        <w:t>Firma y sello</w:t>
       </w:r>
     </w:p>
     <w:sectPr>
+      <w:headerReference w:type="default" r:id="rId9"/>
+      <w:footerReference w:type="default" r:id="rId10"/>
       <w:pgSz w:w="11906" w:h="16838"/>
-      <w:pgMar w:top="907" w:right="1020" w:bottom="907" w:left="1020" w:header="720" w:footer="720" w:gutter="0"/>
+      <w:pgMar w:top="1984" w:right="1191" w:bottom="1134" w:left="1304" w:header="567" w:footer="720" w:gutter="0"/>
       <w:cols w:space="720"/>
       <w:docGrid w:linePitch="360"/>
     </w:sectPr>
   </w:body>
 </w:document>
+</file>
+
+<file path=word/footer1.xml><?xml version="1.0" encoding="utf-8"?>
+<w:ftr xmlns:m="http://schemas.openxmlformats.org/officeDocument/2006/math" xmlns:mc="http://schemas.openxmlformats.org/markup-compatibility/2006" xmlns:mo="http://schemas.microsoft.com/office/mac/office/2008/main" xmlns:mv="urn:schemas-microsoft-com:mac:vml" xmlns:o="urn:schemas-microsoft-com:office:office" xmlns:r="http://schemas.openxmlformats.org/officeDocument/2006/relationships" xmlns:v="urn:schemas-microsoft-com:vml" xmlns:w10="urn:schemas-microsoft-com:office:word" xmlns:w14="http://schemas.microsoft.com/office/word/2010/wordml" xmlns:w="http://schemas.openxmlformats.org/wordprocessingml/2006/main" xmlns:wne="http://schemas.microsoft.com/office/word/2006/wordml" xmlns:wp14="http://schemas.microsoft.com/office/word/2010/wordprocessingDrawing" xmlns:wp="http://schemas.openxmlformats.org/drawingml/2006/wordprocessingDrawing" xmlns:wpc="http://schemas.microsoft.com/office/word/2010/wordprocessingCanvas" xmlns:wpg="http://schemas.microsoft.com/office/word/2010/wordprocessingGroup" xmlns:wpi="http://schemas.microsoft.com/office/word/2010/wordprocessingInk" xmlns:wps="http://schemas.microsoft.com/office/word/2010/wordprocessingShape" mc:Ignorable="w14 wp14">
+  <w:p>
+    <w:pPr>
+      <w:pStyle w:val="Footer"/>
+      <w:jc w:val="right"/>
+    </w:pPr>
+    <w:r>
+      <w:t xml:space="preserve">Página </w:t>
+    </w:r>
+    <w:fldSimple w:instr="PAGE"/>
+    <w:r>
+      <w:t xml:space="preserve"> de </w:t>
+    </w:r>
+    <w:fldSimple w:instr="NUMPAGES"/>
+    <w:r/>
+  </w:p>
+</w:ftr>
+</file>
+
+<file path=word/header1.xml><?xml version="1.0" encoding="utf-8"?>
+<w:hdr xmlns:m="http://schemas.openxmlformats.org/officeDocument/2006/math" xmlns:mc="http://schemas.openxmlformats.org/markup-compatibility/2006" xmlns:mo="http://schemas.microsoft.com/office/mac/office/2008/main" xmlns:mv="urn:schemas-microsoft-com:mac:vml" xmlns:o="urn:schemas-microsoft-com:office:office" xmlns:r="http://schemas.openxmlformats.org/officeDocument/2006/relationships" xmlns:v="urn:schemas-microsoft-com:vml" xmlns:w10="urn:schemas-microsoft-com:office:word" xmlns:w14="http://schemas.microsoft.com/office/word/2010/wordml" xmlns:w="http://schemas.openxmlformats.org/wordprocessingml/2006/main" xmlns:wne="http://schemas.microsoft.com/office/word/2006/wordml" xmlns:wp14="http://schemas.microsoft.com/office/word/2010/wordprocessingDrawing" xmlns:wp="http://schemas.openxmlformats.org/drawingml/2006/wordprocessingDrawing" xmlns:wpc="http://schemas.microsoft.com/office/word/2010/wordprocessingCanvas" xmlns:wpg="http://schemas.microsoft.com/office/word/2010/wordprocessingGroup" xmlns:wpi="http://schemas.microsoft.com/office/word/2010/wordprocessingInk" xmlns:wps="http://schemas.microsoft.com/office/word/2010/wordprocessingShape" mc:Ignorable="w14 wp14">
+  <w:p>
+    <w:pPr>
+      <w:pStyle w:val="Header"/>
+    </w:pPr>
+    <w:r>
+      <w:drawing>
+        <wp:inline xmlns:a="http://schemas.openxmlformats.org/drawingml/2006/main" xmlns:pic="http://schemas.openxmlformats.org/drawingml/2006/picture">
+          <wp:extent cx="1224000" cy="646000"/>
+          <wp:docPr id="1" name="Picture 1"/>
+          <wp:cNvGraphicFramePr>
+            <a:graphicFrameLocks noChangeAspect="1"/>
+          </wp:cNvGraphicFramePr>
+          <a:graphic>
+            <a:graphicData uri="http://schemas.openxmlformats.org/drawingml/2006/picture">
+              <pic:pic>
+                <pic:nvPicPr>
+                  <pic:cNvPr id="0" name="logo-ende-deoruro.png"/>
+                  <pic:cNvPicPr/>
+                </pic:nvPicPr>
+                <pic:blipFill>
+                  <a:blip r:embed="rId1"/>
+                  <a:stretch>
+                    <a:fillRect/>
+                  </a:stretch>
+                </pic:blipFill>
+                <pic:spPr>
+                  <a:xfrm>
+                    <a:off x="0" y="0"/>
+                    <a:ext cx="1224000" cy="646000"/>
+                  </a:xfrm>
+                  <a:prstGeom prst="rect"/>
+                </pic:spPr>
+              </pic:pic>
+            </a:graphicData>
+          </a:graphic>
+        </wp:inline>
+      </w:drawing>
+    </w:r>
+  </w:p>
+</w:hdr>
 </file>
 
 <file path=word/numbering.xml><?xml version="1.0" encoding="utf-8"?>
@@ -661,11 +876,12 @@
     <w:qFormat/>
     <w:rsid w:val="00FC693F"/>
     <w:pPr>
-      <w:spacing w:after="100"/>
+      <w:widowControl/>
+      <w:spacing w:after="140"/>
     </w:pPr>
     <w:rPr>
       <w:rFonts w:ascii="Arial" w:hAnsi="Arial"/>
-      <w:sz w:val="20"/>
+      <w:sz w:val="21"/>
     </w:rPr>
   </w:style>
   <w:style w:type="paragraph" w:styleId="Header">

</xml_diff>

<commit_message>
Restore institutional A6 header and reference layout for evaluation reports
</commit_message>
<xml_diff>
--- a/templates/ende/06.docx
+++ b/templates/ende/06.docx
@@ -4,17 +4,30 @@
   <w:body>
     <w:p>
       <w:pPr>
+        <w:pStyle w:val="EvaluationTitle"/>
         <w:keepNext/>
+        <w:spacing w:after="0"/>
         <w:jc w:val="center"/>
       </w:pPr>
       <w:r>
         <w:rPr>
           <w:b/>
-          <w:sz w:val="24"/>
+          <w:sz w:val="22"/>
         </w:rPr>
-        <w:t>INFORME TÉCNICO DE EVALUACIÓN</w:t>
+        <w:t>INFORME DE CONFORMIDAD</w:t>
         <w:br/>
-        <w:t>DE OFERTAS Y CUADRO COMPARATIVO</w:t>
+        <w:t>(CONTRATACIONES)</w:t>
+      </w:r>
+    </w:p>
+    <w:p>
+      <w:pPr>
+        <w:pStyle w:val="EvaluationForm"/>
+        <w:keepNext/>
+        <w:spacing w:after="320"/>
+        <w:jc w:val="center"/>
+      </w:pPr>
+      <w:r>
+        <w:t>FORMULARIO A6-N014</w:t>
       </w:r>
     </w:p>
     <w:tbl>
@@ -23,16 +36,19 @@
         <w:tblLook w:firstColumn="1" w:firstRow="1" w:lastColumn="0" w:lastRow="0" w:noHBand="0" w:noVBand="1" w:val="04A0"/>
       </w:tblPr>
       <w:tblGrid>
-        <w:gridCol w:w="4705"/>
-        <w:gridCol w:w="4705"/>
+        <w:gridCol w:w="4592"/>
+        <w:gridCol w:w="4592"/>
       </w:tblGrid>
       <w:tr>
         <w:tc>
           <w:tcPr>
-            <w:tcW w:type="dxa" w:w="4705"/>
+            <w:tcW w:type="dxa" w:w="4592"/>
             <w:shd w:fill="EEEEEE"/>
           </w:tcPr>
           <w:p>
+            <w:pPr>
+              <w:spacing w:after="0"/>
+            </w:pPr>
             <w:r>
               <w:rPr>
                 <w:b/>
@@ -43,88 +59,221 @@
         </w:tc>
         <w:tc>
           <w:tcPr>
-            <w:tcW w:type="dxa" w:w="4705"/>
+            <w:tcW w:type="dxa" w:w="4592"/>
             <w:shd w:fill="EEEEEE"/>
           </w:tcPr>
           <w:p>
             <w:pPr>
+              <w:spacing w:after="0"/>
               <w:jc w:val="right"/>
             </w:pPr>
             <w:r>
               <w:rPr>
                 <w:b/>
               </w:rPr>
-              <w:t>Informe N.º {{numero}}</w:t>
+              <w:t>INF.DE ORURO N.º {{numero}}</w:t>
             </w:r>
           </w:p>
         </w:tc>
       </w:tr>
     </w:tbl>
     <w:p/>
-    <w:p>
-      <w:r>
-        <w:rPr>
-          <w:b/>
-        </w:rPr>
-        <w:t xml:space="preserve">A:  </w:t>
-      </w:r>
-      <w:r>
-        <w:t>{{destinatario}}</w:t>
-      </w:r>
-    </w:p>
-    <w:p>
-      <w:r>
-        <w:rPr>
-          <w:b/>
-        </w:rPr>
-        <w:t xml:space="preserve">VÍA:  </w:t>
-      </w:r>
-      <w:r>
-        <w:t>{{via}}</w:t>
-      </w:r>
-    </w:p>
-    <w:p>
-      <w:r>
-        <w:rPr>
-          <w:b/>
-        </w:rPr>
-        <w:t xml:space="preserve">DE:  </w:t>
-      </w:r>
-      <w:r>
-        <w:t>{{solicitante}}</w:t>
-      </w:r>
-    </w:p>
-    <w:p>
-      <w:r>
-        <w:rPr>
-          <w:b/>
-        </w:rPr>
-        <w:t xml:space="preserve">PROCESO:  </w:t>
-      </w:r>
-      <w:r>
-        <w:t>{{objeto}}</w:t>
-      </w:r>
-    </w:p>
-    <w:p>
-      <w:r>
-        <w:rPr>
-          <w:b/>
-        </w:rPr>
-        <w:t xml:space="preserve">SOLICITUD:  </w:t>
-      </w:r>
-      <w:r>
-        <w:t>{{solicitud}}</w:t>
-      </w:r>
-    </w:p>
+    <w:tbl>
+      <w:tblPr>
+        <w:tblW w:type="auto" w:w="0"/>
+        <w:tblLayout w:type="fixed"/>
+        <w:tblLook w:firstColumn="1" w:firstRow="1" w:lastColumn="0" w:lastRow="0" w:noHBand="0" w:noVBand="1" w:val="04A0"/>
+      </w:tblPr>
+      <w:tblGrid>
+        <w:gridCol w:w="1304"/>
+        <w:gridCol w:w="7880"/>
+      </w:tblGrid>
+      <w:tr>
+        <w:trPr>
+          <w:cantSplit/>
+        </w:trPr>
+        <w:tc>
+          <w:tcPr>
+            <w:tcW w:type="dxa" w:w="1304"/>
+            <w:tcMar>
+              <w:right w:w="0" w:type="dxa"/>
+            </w:tcMar>
+          </w:tcPr>
+          <w:p>
+            <w:r>
+              <w:t>A:</w:t>
+            </w:r>
+          </w:p>
+        </w:tc>
+        <w:tc>
+          <w:tcPr>
+            <w:tcW w:type="dxa" w:w="7880"/>
+          </w:tcPr>
+          <w:p>
+            <w:pPr>
+              <w:pStyle w:val="EvaluationName"/>
+              <w:keepNext/>
+              <w:spacing w:after="0"/>
+            </w:pPr>
+            <w:r>
+              <w:t>{{destinatario_nombre}}</w:t>
+            </w:r>
+          </w:p>
+          <w:p>
+            <w:pPr>
+              <w:pStyle w:val="EvaluationRole"/>
+              <w:spacing w:after="0"/>
+            </w:pPr>
+            <w:r>
+              <w:t>{{destinatario_cargo}}</w:t>
+            </w:r>
+          </w:p>
+        </w:tc>
+      </w:tr>
+      <w:tr>
+        <w:trPr>
+          <w:cantSplit/>
+        </w:trPr>
+        <w:tc>
+          <w:tcPr>
+            <w:tcW w:type="dxa" w:w="1304"/>
+            <w:tcMar>
+              <w:right w:w="0" w:type="dxa"/>
+            </w:tcMar>
+          </w:tcPr>
+          <w:p>
+            <w:r>
+              <w:t>VIA:</w:t>
+            </w:r>
+          </w:p>
+        </w:tc>
+        <w:tc>
+          <w:tcPr>
+            <w:tcW w:type="dxa" w:w="7880"/>
+          </w:tcPr>
+          <w:p>
+            <w:pPr>
+              <w:pStyle w:val="EvaluationName"/>
+              <w:keepNext/>
+              <w:spacing w:after="0"/>
+            </w:pPr>
+            <w:r>
+              <w:t>{{via_nombre}}</w:t>
+            </w:r>
+          </w:p>
+          <w:p>
+            <w:pPr>
+              <w:pStyle w:val="EvaluationRole"/>
+              <w:spacing w:after="0"/>
+            </w:pPr>
+            <w:r>
+              <w:t>{{via_cargo}}</w:t>
+            </w:r>
+          </w:p>
+        </w:tc>
+      </w:tr>
+      <w:tr>
+        <w:trPr>
+          <w:cantSplit/>
+        </w:trPr>
+        <w:tc>
+          <w:tcPr>
+            <w:tcW w:type="dxa" w:w="1304"/>
+            <w:tcMar>
+              <w:right w:w="0" w:type="dxa"/>
+            </w:tcMar>
+          </w:tcPr>
+          <w:p>
+            <w:r>
+              <w:t>De:</w:t>
+            </w:r>
+          </w:p>
+        </w:tc>
+        <w:tc>
+          <w:tcPr>
+            <w:tcW w:type="dxa" w:w="7880"/>
+          </w:tcPr>
+          <w:p>
+            <w:pPr>
+              <w:pStyle w:val="EvaluationName"/>
+              <w:keepNext/>
+              <w:spacing w:after="0"/>
+            </w:pPr>
+            <w:r>
+              <w:t>{{solicitante_nombre}}</w:t>
+            </w:r>
+          </w:p>
+          <w:p>
+            <w:pPr>
+              <w:pStyle w:val="EvaluationRole"/>
+              <w:spacing w:after="0"/>
+            </w:pPr>
+            <w:r>
+              <w:t>{{solicitante_cargo}}</w:t>
+            </w:r>
+          </w:p>
+        </w:tc>
+      </w:tr>
+      <w:tr>
+        <w:trPr>
+          <w:cantSplit/>
+        </w:trPr>
+        <w:tc>
+          <w:tcPr>
+            <w:tcW w:type="dxa" w:w="1304"/>
+            <w:tcMar>
+              <w:right w:w="0" w:type="dxa"/>
+            </w:tcMar>
+          </w:tcPr>
+          <w:p>
+            <w:pPr>
+              <w:spacing w:before="280"/>
+            </w:pPr>
+            <w:r>
+              <w:rPr>
+                <w:sz w:val="20"/>
+              </w:rPr>
+              <w:t>PROCESO:</w:t>
+            </w:r>
+          </w:p>
+        </w:tc>
+        <w:tc>
+          <w:tcPr>
+            <w:tcW w:type="dxa" w:w="7880"/>
+          </w:tcPr>
+          <w:p>
+            <w:pPr>
+              <w:pStyle w:val="EvaluationProcess"/>
+              <w:spacing w:before="280" w:after="0"/>
+              <w:jc w:val="both"/>
+            </w:pPr>
+            <w:r>
+              <w:t>REMISIÓN DE INFORME TÉCNICO DE EVALUACIÓN DE COTIZACIONES Y SOLICITUD DE ADJUDICACIÓN - PROCESO "{{objeto}}" (Solicitud No. {{solicitud}})</w:t>
+            </w:r>
+          </w:p>
+          <w:p>
+            <w:pPr>
+              <w:pStyle w:val="EvaluationProcess"/>
+              <w:jc w:val="both"/>
+            </w:pPr>
+            <w:r>
+              <w:t>INFORME TÉCNICO DE EVALUACIÓN DE OFERTAS Y CUADRO COMPARATIVO</w:t>
+            </w:r>
+          </w:p>
+        </w:tc>
+      </w:tr>
+    </w:tbl>
     <w:p>
       <w:pPr>
+        <w:pStyle w:val="EvaluationRule"/>
         <w:pBdr>
-          <w:bottom w:val="single" w:sz="12" w:color="000000"/>
+          <w:bottom w:val="double" w:sz="8" w:color="000000"/>
         </w:pBdr>
       </w:pPr>
     </w:p>
     <w:p>
       <w:pPr>
+        <w:pStyle w:val="EvaluationSection"/>
         <w:keepNext/>
         <w:spacing w:before="200"/>
       </w:pPr>
@@ -142,6 +291,7 @@
     </w:p>
     <w:p>
       <w:pPr>
+        <w:pStyle w:val="EvaluationSection"/>
         <w:keepNext/>
         <w:spacing w:before="200"/>
       </w:pPr>
@@ -159,6 +309,7 @@
     </w:p>
     <w:p>
       <w:pPr>
+        <w:pStyle w:val="EvaluationSection"/>
         <w:keepNext/>
         <w:spacing w:before="200"/>
       </w:pPr>
@@ -184,9 +335,9 @@
       <w:tblGrid>
         <w:gridCol w:w="567"/>
         <w:gridCol w:w="1474"/>
-        <w:gridCol w:w="2948"/>
+        <w:gridCol w:w="2835"/>
         <w:gridCol w:w="1191"/>
-        <w:gridCol w:w="3231"/>
+        <w:gridCol w:w="3118"/>
       </w:tblGrid>
       <w:tr>
         <w:trPr>
@@ -230,7 +381,7 @@
         </w:tc>
         <w:tc>
           <w:tcPr>
-            <w:tcW w:type="dxa" w:w="2948"/>
+            <w:tcW w:type="dxa" w:w="2835"/>
             <w:shd w:fill="F3F4E5"/>
           </w:tcPr>
           <w:p>
@@ -266,7 +417,7 @@
         </w:tc>
         <w:tc>
           <w:tcPr>
-            <w:tcW w:type="dxa" w:w="3231"/>
+            <w:tcW w:type="dxa" w:w="3118"/>
             <w:shd w:fill="F3F4E5"/>
           </w:tcPr>
           <w:p>
@@ -318,7 +469,7 @@
         </w:tc>
         <w:tc>
           <w:tcPr>
-            <w:tcW w:type="dxa" w:w="2948"/>
+            <w:tcW w:type="dxa" w:w="2835"/>
           </w:tcPr>
           <w:p>
             <w:pPr>
@@ -350,7 +501,7 @@
         </w:tc>
         <w:tc>
           <w:tcPr>
-            <w:tcW w:type="dxa" w:w="3231"/>
+            <w:tcW w:type="dxa" w:w="3118"/>
           </w:tcPr>
           <w:p>
             <w:pPr>
@@ -368,6 +519,7 @@
     </w:tbl>
     <w:p>
       <w:pPr>
+        <w:pStyle w:val="EvaluationSection"/>
         <w:keepNext/>
         <w:spacing w:before="200"/>
       </w:pPr>
@@ -385,6 +537,7 @@
     </w:p>
     <w:p>
       <w:pPr>
+        <w:pStyle w:val="EvaluationSection"/>
         <w:keepNext/>
         <w:spacing w:before="200"/>
       </w:pPr>
@@ -440,7 +593,7 @@
       <w:headerReference w:type="default" r:id="rId9"/>
       <w:footerReference w:type="default" r:id="rId10"/>
       <w:pgSz w:w="11906" w:h="16838"/>
-      <w:pgMar w:top="1984" w:right="1191" w:bottom="1134" w:left="1304" w:header="567" w:footer="720" w:gutter="0"/>
+      <w:pgMar w:top="2211" w:right="1162" w:bottom="1134" w:left="1559" w:header="794" w:footer="720" w:gutter="0"/>
       <w:cols w:space="720"/>
       <w:docGrid w:linePitch="360"/>
     </w:sectPr>
@@ -477,7 +630,7 @@
     <w:r>
       <w:drawing>
         <wp:inline xmlns:a="http://schemas.openxmlformats.org/drawingml/2006/main" xmlns:pic="http://schemas.openxmlformats.org/drawingml/2006/picture">
-          <wp:extent cx="1224000" cy="646000"/>
+          <wp:extent cx="1332000" cy="703000"/>
           <wp:docPr id="1" name="Picture 1"/>
           <wp:cNvGraphicFramePr>
             <a:graphicFrameLocks noChangeAspect="1"/>
@@ -498,7 +651,7 @@
                 <pic:spPr>
                   <a:xfrm>
                     <a:off x="0" y="0"/>
-                    <a:ext cx="1224000" cy="646000"/>
+                    <a:ext cx="1332000" cy="703000"/>
                   </a:xfrm>
                   <a:prstGeom prst="rect"/>
                 </pic:spPr>
@@ -881,7 +1034,7 @@
     </w:pPr>
     <w:rPr>
       <w:rFonts w:ascii="Arial" w:hAnsi="Arial"/>
-      <w:sz w:val="21"/>
+      <w:sz w:val="22"/>
     </w:rPr>
   </w:style>
   <w:style w:type="paragraph" w:styleId="Header">
@@ -12565,6 +12718,50 @@
         <w:shd w:val="clear" w:color="auto" w:fill="FBCAA2" w:themeFill="accent6" w:themeFillTint="7F"/>
       </w:tcPr>
     </w:tblStylePr>
+  </w:style>
+  <w:style w:type="paragraph" w:customStyle="1" w:styleId="EvaluationTitle">
+    <w:name w:val="Evaluation Title"/>
+    <w:basedOn w:val="Normal"/>
+  </w:style>
+  <w:style w:type="paragraph" w:customStyle="1" w:styleId="EvaluationForm">
+    <w:name w:val="Evaluation Form"/>
+    <w:basedOn w:val="Normal"/>
+  </w:style>
+  <w:style w:type="paragraph" w:customStyle="1" w:styleId="EvaluationName">
+    <w:name w:val="Evaluation Name"/>
+    <w:basedOn w:val="Normal"/>
+    <w:rPr>
+      <w:b/>
+    </w:rPr>
+  </w:style>
+  <w:style w:type="paragraph" w:customStyle="1" w:styleId="EvaluationRole">
+    <w:name w:val="Evaluation Role"/>
+    <w:basedOn w:val="Normal"/>
+    <w:pPr>
+      <w:spacing w:before="200"/>
+    </w:pPr>
+    <w:rPr>
+      <w:b/>
+      <w:color w:val="808080"/>
+    </w:rPr>
+  </w:style>
+  <w:style w:type="paragraph" w:customStyle="1" w:styleId="EvaluationProcess">
+    <w:name w:val="Evaluation Process"/>
+    <w:basedOn w:val="Normal"/>
+    <w:rPr>
+      <w:b/>
+    </w:rPr>
+  </w:style>
+  <w:style w:type="paragraph" w:customStyle="1" w:styleId="EvaluationRule">
+    <w:name w:val="Evaluation Rule"/>
+    <w:basedOn w:val="Normal"/>
+  </w:style>
+  <w:style w:type="paragraph" w:customStyle="1" w:styleId="EvaluationSection">
+    <w:name w:val="Evaluation Section"/>
+    <w:basedOn w:val="Normal"/>
+    <w:rPr>
+      <w:b/>
+    </w:rPr>
   </w:style>
 </w:styles>
 </file>

</xml_diff>